<commit_message>
feat(#748): the Test Framework declares the offer request forms; the catalogue follows them
- offerRequestForms (SEARCH, SPECIFICATION, TRIP_IDS) in the Test Framework,
  Sales Flows > Offer requests. Absent = every form.
- Catalogue: a one-way search without the train filter goes as a trip
  specification when only SPECIFICATION is declared, and is offered twice
  (<code>_SPEC) when both are. Returns, train-filter and trip-id scenarios
  are refused when their form is not declared.
- [WARNING] for a scenario whose form is not declared; the trip type picker
  marks it; a copy between providers says so.
- Exchange offers ask by tripSpecifications when the sale did.
- Release 2026.324: server 1.11.289, collection OTST_V2.0.163.

Co-Authored-By: Claude Opus 5.5 <noreply@anthropic.com>
Claude-Session: https://claude.ai/code/session_01A3xnyikQ6UQkr5ZjBscCyY
</commit_message>
<xml_diff>
--- a/Documentation/User_Guides/OSCAR_Test_Config_Checklist.docx
+++ b/Documentation/User_Guides/OSCAR_Test_Config_Checklist.docx
@@ -183,11 +183,7 @@
               <w:right w:type="dxa" w:w="120"/>
             </w:tcMar>
           </w:tcPr>
-          <w:p>
-            <w:r>
-              <w:t xml:space="preserve"/>
-            </w:r>
-          </w:p>
+          <w:p/>
         </w:tc>
         <w:tc>
           <w:tcPr>
@@ -205,11 +201,7 @@
               <w:right w:type="dxa" w:w="120"/>
             </w:tcMar>
           </w:tcPr>
-          <w:p>
-            <w:r>
-              <w:t xml:space="preserve"/>
-            </w:r>
-          </w:p>
+          <w:p/>
         </w:tc>
         <w:tc>
           <w:tcPr>
@@ -227,11 +219,7 @@
               <w:right w:type="dxa" w:w="120"/>
             </w:tcMar>
           </w:tcPr>
-          <w:p>
-            <w:r>
-              <w:t xml:space="preserve"/>
-            </w:r>
-          </w:p>
+          <w:p/>
         </w:tc>
         <w:tc>
           <w:tcPr>
@@ -249,11 +237,7 @@
               <w:right w:type="dxa" w:w="120"/>
             </w:tcMar>
           </w:tcPr>
-          <w:p>
-            <w:r>
-              <w:t xml:space="preserve"/>
-            </w:r>
-          </w:p>
+          <w:p/>
         </w:tc>
       </w:tr>
     </w:tbl>
@@ -2231,7 +2215,7 @@
               <w:t xml:space="preserve">A4.2  </w:t>
             </w:r>
             <w:r>
-              <w:t xml:space="preserve">Can offers be requested by trip id, after </w:t>
+              <w:t xml:space="preserve">How can offers be requested: by trip search (</w:t>
             </w:r>
             <w:r>
               <w:rPr>
@@ -2239,10 +2223,43 @@
                 <w:sz w:val="19"/>
                 <w:szCs w:val="19"/>
               </w:rPr>
+              <w:t xml:space="preserve">tripSearchCriteria</w:t>
+            </w:r>
+            <w:r>
+              <w:t xml:space="preserve">), by trip specification (</w:t>
+            </w:r>
+            <w:r>
+              <w:rPr>
+                <w:rFonts w:ascii="Consolas" w:cs="Consolas" w:eastAsia="Consolas" w:hAnsi="Consolas"/>
+                <w:sz w:val="19"/>
+                <w:szCs w:val="19"/>
+              </w:rPr>
+              <w:t xml:space="preserve">tripSpecifications</w:t>
+            </w:r>
+            <w:r>
+              <w:t xml:space="preserve">, the exact train and its times), by trip id after </w:t>
+            </w:r>
+            <w:r>
+              <w:rPr>
+                <w:rFonts w:ascii="Consolas" w:cs="Consolas" w:eastAsia="Consolas" w:hAnsi="Consolas"/>
+                <w:sz w:val="19"/>
+                <w:szCs w:val="19"/>
+              </w:rPr>
               <w:t xml:space="preserve">POST /trips-collection</w:t>
             </w:r>
             <w:r>
-              <w:t xml:space="preserve">?</w:t>
+              <w:t xml:space="preserve"> (</w:t>
+            </w:r>
+            <w:r>
+              <w:rPr>
+                <w:rFonts w:ascii="Consolas" w:cs="Consolas" w:eastAsia="Consolas" w:hAnsi="Consolas"/>
+                <w:sz w:val="19"/>
+                <w:szCs w:val="19"/>
+              </w:rPr>
+              <w:t xml:space="preserve">tripIds</w:t>
+            </w:r>
+            <w:r>
+              <w:t xml:space="preserve">)? Which is preferred?</w:t>
             </w:r>
           </w:p>
         </w:tc>
@@ -4544,11 +4561,7 @@
               <w:right w:type="dxa" w:w="120"/>
             </w:tcMar>
           </w:tcPr>
-          <w:p>
-            <w:r>
-              <w:t xml:space="preserve"/>
-            </w:r>
-          </w:p>
+          <w:p/>
         </w:tc>
         <w:tc>
           <w:tcPr>
@@ -4566,11 +4579,7 @@
               <w:right w:type="dxa" w:w="120"/>
             </w:tcMar>
           </w:tcPr>
-          <w:p>
-            <w:r>
-              <w:t xml:space="preserve"/>
-            </w:r>
-          </w:p>
+          <w:p/>
         </w:tc>
         <w:tc>
           <w:tcPr>
@@ -4588,11 +4597,7 @@
               <w:right w:type="dxa" w:w="120"/>
             </w:tcMar>
           </w:tcPr>
-          <w:p>
-            <w:r>
-              <w:t xml:space="preserve"/>
-            </w:r>
-          </w:p>
+          <w:p/>
         </w:tc>
         <w:tc>
           <w:tcPr>
@@ -4610,11 +4615,7 @@
               <w:right w:type="dxa" w:w="120"/>
             </w:tcMar>
           </w:tcPr>
-          <w:p>
-            <w:r>
-              <w:t xml:space="preserve"/>
-            </w:r>
-          </w:p>
+          <w:p/>
         </w:tc>
         <w:tc>
           <w:tcPr>
@@ -4632,11 +4633,7 @@
               <w:right w:type="dxa" w:w="120"/>
             </w:tcMar>
           </w:tcPr>
-          <w:p>
-            <w:r>
-              <w:t xml:space="preserve"/>
-            </w:r>
-          </w:p>
+          <w:p/>
         </w:tc>
       </w:tr>
       <w:tr>
@@ -4659,11 +4656,7 @@
               <w:right w:type="dxa" w:w="120"/>
             </w:tcMar>
           </w:tcPr>
-          <w:p>
-            <w:r>
-              <w:t xml:space="preserve"/>
-            </w:r>
-          </w:p>
+          <w:p/>
         </w:tc>
         <w:tc>
           <w:tcPr>
@@ -4681,11 +4674,7 @@
               <w:right w:type="dxa" w:w="120"/>
             </w:tcMar>
           </w:tcPr>
-          <w:p>
-            <w:r>
-              <w:t xml:space="preserve"/>
-            </w:r>
-          </w:p>
+          <w:p/>
         </w:tc>
         <w:tc>
           <w:tcPr>
@@ -4703,11 +4692,7 @@
               <w:right w:type="dxa" w:w="120"/>
             </w:tcMar>
           </w:tcPr>
-          <w:p>
-            <w:r>
-              <w:t xml:space="preserve"/>
-            </w:r>
-          </w:p>
+          <w:p/>
         </w:tc>
         <w:tc>
           <w:tcPr>
@@ -4725,11 +4710,7 @@
               <w:right w:type="dxa" w:w="120"/>
             </w:tcMar>
           </w:tcPr>
-          <w:p>
-            <w:r>
-              <w:t xml:space="preserve"/>
-            </w:r>
-          </w:p>
+          <w:p/>
         </w:tc>
         <w:tc>
           <w:tcPr>
@@ -4747,11 +4728,7 @@
               <w:right w:type="dxa" w:w="120"/>
             </w:tcMar>
           </w:tcPr>
-          <w:p>
-            <w:r>
-              <w:t xml:space="preserve"/>
-            </w:r>
-          </w:p>
+          <w:p/>
         </w:tc>
       </w:tr>
       <w:tr>
@@ -4774,11 +4751,7 @@
               <w:right w:type="dxa" w:w="120"/>
             </w:tcMar>
           </w:tcPr>
-          <w:p>
-            <w:r>
-              <w:t xml:space="preserve"/>
-            </w:r>
-          </w:p>
+          <w:p/>
         </w:tc>
         <w:tc>
           <w:tcPr>
@@ -4796,11 +4769,7 @@
               <w:right w:type="dxa" w:w="120"/>
             </w:tcMar>
           </w:tcPr>
-          <w:p>
-            <w:r>
-              <w:t xml:space="preserve"/>
-            </w:r>
-          </w:p>
+          <w:p/>
         </w:tc>
         <w:tc>
           <w:tcPr>
@@ -4818,11 +4787,7 @@
               <w:right w:type="dxa" w:w="120"/>
             </w:tcMar>
           </w:tcPr>
-          <w:p>
-            <w:r>
-              <w:t xml:space="preserve"/>
-            </w:r>
-          </w:p>
+          <w:p/>
         </w:tc>
         <w:tc>
           <w:tcPr>
@@ -4840,11 +4805,7 @@
               <w:right w:type="dxa" w:w="120"/>
             </w:tcMar>
           </w:tcPr>
-          <w:p>
-            <w:r>
-              <w:t xml:space="preserve"/>
-            </w:r>
-          </w:p>
+          <w:p/>
         </w:tc>
         <w:tc>
           <w:tcPr>
@@ -4862,11 +4823,7 @@
               <w:right w:type="dxa" w:w="120"/>
             </w:tcMar>
           </w:tcPr>
-          <w:p>
-            <w:r>
-              <w:t xml:space="preserve"/>
-            </w:r>
-          </w:p>
+          <w:p/>
         </w:tc>
       </w:tr>
     </w:tbl>
@@ -6038,11 +5995,7 @@
               <w:right w:type="dxa" w:w="120"/>
             </w:tcMar>
           </w:tcPr>
-          <w:p>
-            <w:r>
-              <w:t xml:space="preserve"/>
-            </w:r>
-          </w:p>
+          <w:p/>
         </w:tc>
         <w:tc>
           <w:tcPr>
@@ -6060,11 +6013,7 @@
               <w:right w:type="dxa" w:w="120"/>
             </w:tcMar>
           </w:tcPr>
-          <w:p>
-            <w:r>
-              <w:t xml:space="preserve"/>
-            </w:r>
-          </w:p>
+          <w:p/>
         </w:tc>
         <w:tc>
           <w:tcPr>
@@ -6082,11 +6031,7 @@
               <w:right w:type="dxa" w:w="120"/>
             </w:tcMar>
           </w:tcPr>
-          <w:p>
-            <w:r>
-              <w:t xml:space="preserve"/>
-            </w:r>
-          </w:p>
+          <w:p/>
         </w:tc>
         <w:tc>
           <w:tcPr>
@@ -6104,11 +6049,7 @@
               <w:right w:type="dxa" w:w="120"/>
             </w:tcMar>
           </w:tcPr>
-          <w:p>
-            <w:r>
-              <w:t xml:space="preserve"/>
-            </w:r>
-          </w:p>
+          <w:p/>
         </w:tc>
         <w:tc>
           <w:tcPr>
@@ -6126,11 +6067,7 @@
               <w:right w:type="dxa" w:w="120"/>
             </w:tcMar>
           </w:tcPr>
-          <w:p>
-            <w:r>
-              <w:t xml:space="preserve"/>
-            </w:r>
-          </w:p>
+          <w:p/>
         </w:tc>
       </w:tr>
       <w:tr>
@@ -6153,11 +6090,7 @@
               <w:right w:type="dxa" w:w="120"/>
             </w:tcMar>
           </w:tcPr>
-          <w:p>
-            <w:r>
-              <w:t xml:space="preserve"/>
-            </w:r>
-          </w:p>
+          <w:p/>
         </w:tc>
         <w:tc>
           <w:tcPr>
@@ -6175,11 +6108,7 @@
               <w:right w:type="dxa" w:w="120"/>
             </w:tcMar>
           </w:tcPr>
-          <w:p>
-            <w:r>
-              <w:t xml:space="preserve"/>
-            </w:r>
-          </w:p>
+          <w:p/>
         </w:tc>
         <w:tc>
           <w:tcPr>
@@ -6197,11 +6126,7 @@
               <w:right w:type="dxa" w:w="120"/>
             </w:tcMar>
           </w:tcPr>
-          <w:p>
-            <w:r>
-              <w:t xml:space="preserve"/>
-            </w:r>
-          </w:p>
+          <w:p/>
         </w:tc>
         <w:tc>
           <w:tcPr>
@@ -6219,11 +6144,7 @@
               <w:right w:type="dxa" w:w="120"/>
             </w:tcMar>
           </w:tcPr>
-          <w:p>
-            <w:r>
-              <w:t xml:space="preserve"/>
-            </w:r>
-          </w:p>
+          <w:p/>
         </w:tc>
         <w:tc>
           <w:tcPr>
@@ -6241,11 +6162,7 @@
               <w:right w:type="dxa" w:w="120"/>
             </w:tcMar>
           </w:tcPr>
-          <w:p>
-            <w:r>
-              <w:t xml:space="preserve"/>
-            </w:r>
-          </w:p>
+          <w:p/>
         </w:tc>
       </w:tr>
       <w:tr>
@@ -6268,11 +6185,7 @@
               <w:right w:type="dxa" w:w="120"/>
             </w:tcMar>
           </w:tcPr>
-          <w:p>
-            <w:r>
-              <w:t xml:space="preserve"/>
-            </w:r>
-          </w:p>
+          <w:p/>
         </w:tc>
         <w:tc>
           <w:tcPr>
@@ -6290,11 +6203,7 @@
               <w:right w:type="dxa" w:w="120"/>
             </w:tcMar>
           </w:tcPr>
-          <w:p>
-            <w:r>
-              <w:t xml:space="preserve"/>
-            </w:r>
-          </w:p>
+          <w:p/>
         </w:tc>
         <w:tc>
           <w:tcPr>
@@ -6312,11 +6221,7 @@
               <w:right w:type="dxa" w:w="120"/>
             </w:tcMar>
           </w:tcPr>
-          <w:p>
-            <w:r>
-              <w:t xml:space="preserve"/>
-            </w:r>
-          </w:p>
+          <w:p/>
         </w:tc>
         <w:tc>
           <w:tcPr>
@@ -6334,11 +6239,7 @@
               <w:right w:type="dxa" w:w="120"/>
             </w:tcMar>
           </w:tcPr>
-          <w:p>
-            <w:r>
-              <w:t xml:space="preserve"/>
-            </w:r>
-          </w:p>
+          <w:p/>
         </w:tc>
         <w:tc>
           <w:tcPr>
@@ -6356,11 +6257,7 @@
               <w:right w:type="dxa" w:w="120"/>
             </w:tcMar>
           </w:tcPr>
-          <w:p>
-            <w:r>
-              <w:t xml:space="preserve"/>
-            </w:r>
-          </w:p>
+          <w:p/>
         </w:tc>
       </w:tr>
     </w:tbl>
@@ -7532,11 +7429,7 @@
               <w:right w:type="dxa" w:w="120"/>
             </w:tcMar>
           </w:tcPr>
-          <w:p>
-            <w:r>
-              <w:t xml:space="preserve"/>
-            </w:r>
-          </w:p>
+          <w:p/>
         </w:tc>
         <w:tc>
           <w:tcPr>
@@ -7554,11 +7447,7 @@
               <w:right w:type="dxa" w:w="120"/>
             </w:tcMar>
           </w:tcPr>
-          <w:p>
-            <w:r>
-              <w:t xml:space="preserve"/>
-            </w:r>
-          </w:p>
+          <w:p/>
         </w:tc>
         <w:tc>
           <w:tcPr>
@@ -7576,11 +7465,7 @@
               <w:right w:type="dxa" w:w="120"/>
             </w:tcMar>
           </w:tcPr>
-          <w:p>
-            <w:r>
-              <w:t xml:space="preserve"/>
-            </w:r>
-          </w:p>
+          <w:p/>
         </w:tc>
         <w:tc>
           <w:tcPr>
@@ -7598,11 +7483,7 @@
               <w:right w:type="dxa" w:w="120"/>
             </w:tcMar>
           </w:tcPr>
-          <w:p>
-            <w:r>
-              <w:t xml:space="preserve"/>
-            </w:r>
-          </w:p>
+          <w:p/>
         </w:tc>
         <w:tc>
           <w:tcPr>
@@ -7620,11 +7501,7 @@
               <w:right w:type="dxa" w:w="120"/>
             </w:tcMar>
           </w:tcPr>
-          <w:p>
-            <w:r>
-              <w:t xml:space="preserve"/>
-            </w:r>
-          </w:p>
+          <w:p/>
         </w:tc>
       </w:tr>
       <w:tr>
@@ -7647,11 +7524,7 @@
               <w:right w:type="dxa" w:w="120"/>
             </w:tcMar>
           </w:tcPr>
-          <w:p>
-            <w:r>
-              <w:t xml:space="preserve"/>
-            </w:r>
-          </w:p>
+          <w:p/>
         </w:tc>
         <w:tc>
           <w:tcPr>
@@ -7669,11 +7542,7 @@
               <w:right w:type="dxa" w:w="120"/>
             </w:tcMar>
           </w:tcPr>
-          <w:p>
-            <w:r>
-              <w:t xml:space="preserve"/>
-            </w:r>
-          </w:p>
+          <w:p/>
         </w:tc>
         <w:tc>
           <w:tcPr>
@@ -7691,11 +7560,7 @@
               <w:right w:type="dxa" w:w="120"/>
             </w:tcMar>
           </w:tcPr>
-          <w:p>
-            <w:r>
-              <w:t xml:space="preserve"/>
-            </w:r>
-          </w:p>
+          <w:p/>
         </w:tc>
         <w:tc>
           <w:tcPr>
@@ -7713,11 +7578,7 @@
               <w:right w:type="dxa" w:w="120"/>
             </w:tcMar>
           </w:tcPr>
-          <w:p>
-            <w:r>
-              <w:t xml:space="preserve"/>
-            </w:r>
-          </w:p>
+          <w:p/>
         </w:tc>
         <w:tc>
           <w:tcPr>
@@ -7735,11 +7596,7 @@
               <w:right w:type="dxa" w:w="120"/>
             </w:tcMar>
           </w:tcPr>
-          <w:p>
-            <w:r>
-              <w:t xml:space="preserve"/>
-            </w:r>
-          </w:p>
+          <w:p/>
         </w:tc>
       </w:tr>
       <w:tr>
@@ -7762,11 +7619,7 @@
               <w:right w:type="dxa" w:w="120"/>
             </w:tcMar>
           </w:tcPr>
-          <w:p>
-            <w:r>
-              <w:t xml:space="preserve"/>
-            </w:r>
-          </w:p>
+          <w:p/>
         </w:tc>
         <w:tc>
           <w:tcPr>
@@ -7784,11 +7637,7 @@
               <w:right w:type="dxa" w:w="120"/>
             </w:tcMar>
           </w:tcPr>
-          <w:p>
-            <w:r>
-              <w:t xml:space="preserve"/>
-            </w:r>
-          </w:p>
+          <w:p/>
         </w:tc>
         <w:tc>
           <w:tcPr>
@@ -7806,11 +7655,7 @@
               <w:right w:type="dxa" w:w="120"/>
             </w:tcMar>
           </w:tcPr>
-          <w:p>
-            <w:r>
-              <w:t xml:space="preserve"/>
-            </w:r>
-          </w:p>
+          <w:p/>
         </w:tc>
         <w:tc>
           <w:tcPr>
@@ -7828,11 +7673,7 @@
               <w:right w:type="dxa" w:w="120"/>
             </w:tcMar>
           </w:tcPr>
-          <w:p>
-            <w:r>
-              <w:t xml:space="preserve"/>
-            </w:r>
-          </w:p>
+          <w:p/>
         </w:tc>
         <w:tc>
           <w:tcPr>
@@ -7850,11 +7691,7 @@
               <w:right w:type="dxa" w:w="120"/>
             </w:tcMar>
           </w:tcPr>
-          <w:p>
-            <w:r>
-              <w:t xml:space="preserve"/>
-            </w:r>
-          </w:p>
+          <w:p/>
         </w:tc>
       </w:tr>
     </w:tbl>
@@ -9026,11 +8863,7 @@
               <w:right w:type="dxa" w:w="120"/>
             </w:tcMar>
           </w:tcPr>
-          <w:p>
-            <w:r>
-              <w:t xml:space="preserve"/>
-            </w:r>
-          </w:p>
+          <w:p/>
         </w:tc>
         <w:tc>
           <w:tcPr>
@@ -9048,11 +8881,7 @@
               <w:right w:type="dxa" w:w="120"/>
             </w:tcMar>
           </w:tcPr>
-          <w:p>
-            <w:r>
-              <w:t xml:space="preserve"/>
-            </w:r>
-          </w:p>
+          <w:p/>
         </w:tc>
         <w:tc>
           <w:tcPr>
@@ -9070,11 +8899,7 @@
               <w:right w:type="dxa" w:w="120"/>
             </w:tcMar>
           </w:tcPr>
-          <w:p>
-            <w:r>
-              <w:t xml:space="preserve"/>
-            </w:r>
-          </w:p>
+          <w:p/>
         </w:tc>
         <w:tc>
           <w:tcPr>
@@ -9092,11 +8917,7 @@
               <w:right w:type="dxa" w:w="120"/>
             </w:tcMar>
           </w:tcPr>
-          <w:p>
-            <w:r>
-              <w:t xml:space="preserve"/>
-            </w:r>
-          </w:p>
+          <w:p/>
         </w:tc>
         <w:tc>
           <w:tcPr>
@@ -9114,11 +8935,7 @@
               <w:right w:type="dxa" w:w="120"/>
             </w:tcMar>
           </w:tcPr>
-          <w:p>
-            <w:r>
-              <w:t xml:space="preserve"/>
-            </w:r>
-          </w:p>
+          <w:p/>
         </w:tc>
       </w:tr>
       <w:tr>
@@ -9141,11 +8958,7 @@
               <w:right w:type="dxa" w:w="120"/>
             </w:tcMar>
           </w:tcPr>
-          <w:p>
-            <w:r>
-              <w:t xml:space="preserve"/>
-            </w:r>
-          </w:p>
+          <w:p/>
         </w:tc>
         <w:tc>
           <w:tcPr>
@@ -9163,11 +8976,7 @@
               <w:right w:type="dxa" w:w="120"/>
             </w:tcMar>
           </w:tcPr>
-          <w:p>
-            <w:r>
-              <w:t xml:space="preserve"/>
-            </w:r>
-          </w:p>
+          <w:p/>
         </w:tc>
         <w:tc>
           <w:tcPr>
@@ -9185,11 +8994,7 @@
               <w:right w:type="dxa" w:w="120"/>
             </w:tcMar>
           </w:tcPr>
-          <w:p>
-            <w:r>
-              <w:t xml:space="preserve"/>
-            </w:r>
-          </w:p>
+          <w:p/>
         </w:tc>
         <w:tc>
           <w:tcPr>
@@ -9207,11 +9012,7 @@
               <w:right w:type="dxa" w:w="120"/>
             </w:tcMar>
           </w:tcPr>
-          <w:p>
-            <w:r>
-              <w:t xml:space="preserve"/>
-            </w:r>
-          </w:p>
+          <w:p/>
         </w:tc>
         <w:tc>
           <w:tcPr>
@@ -9229,11 +9030,7 @@
               <w:right w:type="dxa" w:w="120"/>
             </w:tcMar>
           </w:tcPr>
-          <w:p>
-            <w:r>
-              <w:t xml:space="preserve"/>
-            </w:r>
-          </w:p>
+          <w:p/>
         </w:tc>
       </w:tr>
       <w:tr>
@@ -9256,11 +9053,7 @@
               <w:right w:type="dxa" w:w="120"/>
             </w:tcMar>
           </w:tcPr>
-          <w:p>
-            <w:r>
-              <w:t xml:space="preserve"/>
-            </w:r>
-          </w:p>
+          <w:p/>
         </w:tc>
         <w:tc>
           <w:tcPr>
@@ -9278,11 +9071,7 @@
               <w:right w:type="dxa" w:w="120"/>
             </w:tcMar>
           </w:tcPr>
-          <w:p>
-            <w:r>
-              <w:t xml:space="preserve"/>
-            </w:r>
-          </w:p>
+          <w:p/>
         </w:tc>
         <w:tc>
           <w:tcPr>
@@ -9300,11 +9089,7 @@
               <w:right w:type="dxa" w:w="120"/>
             </w:tcMar>
           </w:tcPr>
-          <w:p>
-            <w:r>
-              <w:t xml:space="preserve"/>
-            </w:r>
-          </w:p>
+          <w:p/>
         </w:tc>
         <w:tc>
           <w:tcPr>
@@ -9322,11 +9107,7 @@
               <w:right w:type="dxa" w:w="120"/>
             </w:tcMar>
           </w:tcPr>
-          <w:p>
-            <w:r>
-              <w:t xml:space="preserve"/>
-            </w:r>
-          </w:p>
+          <w:p/>
         </w:tc>
         <w:tc>
           <w:tcPr>
@@ -9344,11 +9125,7 @@
               <w:right w:type="dxa" w:w="120"/>
             </w:tcMar>
           </w:tcPr>
-          <w:p>
-            <w:r>
-              <w:t xml:space="preserve"/>
-            </w:r>
-          </w:p>
+          <w:p/>
         </w:tc>
       </w:tr>
     </w:tbl>
@@ -10457,11 +10234,7 @@
               <w:right w:type="dxa" w:w="120"/>
             </w:tcMar>
           </w:tcPr>
-          <w:p>
-            <w:r>
-              <w:t xml:space="preserve"/>
-            </w:r>
-          </w:p>
+          <w:p/>
         </w:tc>
         <w:tc>
           <w:tcPr>
@@ -10479,11 +10252,7 @@
               <w:right w:type="dxa" w:w="120"/>
             </w:tcMar>
           </w:tcPr>
-          <w:p>
-            <w:r>
-              <w:t xml:space="preserve"/>
-            </w:r>
-          </w:p>
+          <w:p/>
         </w:tc>
         <w:tc>
           <w:tcPr>
@@ -10501,11 +10270,7 @@
               <w:right w:type="dxa" w:w="120"/>
             </w:tcMar>
           </w:tcPr>
-          <w:p>
-            <w:r>
-              <w:t xml:space="preserve"/>
-            </w:r>
-          </w:p>
+          <w:p/>
         </w:tc>
         <w:tc>
           <w:tcPr>
@@ -10523,11 +10288,7 @@
               <w:right w:type="dxa" w:w="120"/>
             </w:tcMar>
           </w:tcPr>
-          <w:p>
-            <w:r>
-              <w:t xml:space="preserve"/>
-            </w:r>
-          </w:p>
+          <w:p/>
         </w:tc>
         <w:tc>
           <w:tcPr>
@@ -10545,11 +10306,7 @@
               <w:right w:type="dxa" w:w="120"/>
             </w:tcMar>
           </w:tcPr>
-          <w:p>
-            <w:r>
-              <w:t xml:space="preserve"/>
-            </w:r>
-          </w:p>
+          <w:p/>
         </w:tc>
         <w:tc>
           <w:tcPr>
@@ -10567,11 +10324,7 @@
               <w:right w:type="dxa" w:w="120"/>
             </w:tcMar>
           </w:tcPr>
-          <w:p>
-            <w:r>
-              <w:t xml:space="preserve"/>
-            </w:r>
-          </w:p>
+          <w:p/>
         </w:tc>
       </w:tr>
       <w:tr>
@@ -10594,11 +10347,7 @@
               <w:right w:type="dxa" w:w="120"/>
             </w:tcMar>
           </w:tcPr>
-          <w:p>
-            <w:r>
-              <w:t xml:space="preserve"/>
-            </w:r>
-          </w:p>
+          <w:p/>
         </w:tc>
         <w:tc>
           <w:tcPr>
@@ -10616,11 +10365,7 @@
               <w:right w:type="dxa" w:w="120"/>
             </w:tcMar>
           </w:tcPr>
-          <w:p>
-            <w:r>
-              <w:t xml:space="preserve"/>
-            </w:r>
-          </w:p>
+          <w:p/>
         </w:tc>
         <w:tc>
           <w:tcPr>
@@ -10638,11 +10383,7 @@
               <w:right w:type="dxa" w:w="120"/>
             </w:tcMar>
           </w:tcPr>
-          <w:p>
-            <w:r>
-              <w:t xml:space="preserve"/>
-            </w:r>
-          </w:p>
+          <w:p/>
         </w:tc>
         <w:tc>
           <w:tcPr>
@@ -10660,11 +10401,7 @@
               <w:right w:type="dxa" w:w="120"/>
             </w:tcMar>
           </w:tcPr>
-          <w:p>
-            <w:r>
-              <w:t xml:space="preserve"/>
-            </w:r>
-          </w:p>
+          <w:p/>
         </w:tc>
         <w:tc>
           <w:tcPr>
@@ -10682,11 +10419,7 @@
               <w:right w:type="dxa" w:w="120"/>
             </w:tcMar>
           </w:tcPr>
-          <w:p>
-            <w:r>
-              <w:t xml:space="preserve"/>
-            </w:r>
-          </w:p>
+          <w:p/>
         </w:tc>
         <w:tc>
           <w:tcPr>
@@ -10704,11 +10437,7 @@
               <w:right w:type="dxa" w:w="120"/>
             </w:tcMar>
           </w:tcPr>
-          <w:p>
-            <w:r>
-              <w:t xml:space="preserve"/>
-            </w:r>
-          </w:p>
+          <w:p/>
         </w:tc>
       </w:tr>
       <w:tr>
@@ -10731,11 +10460,7 @@
               <w:right w:type="dxa" w:w="120"/>
             </w:tcMar>
           </w:tcPr>
-          <w:p>
-            <w:r>
-              <w:t xml:space="preserve"/>
-            </w:r>
-          </w:p>
+          <w:p/>
         </w:tc>
         <w:tc>
           <w:tcPr>
@@ -10753,11 +10478,7 @@
               <w:right w:type="dxa" w:w="120"/>
             </w:tcMar>
           </w:tcPr>
-          <w:p>
-            <w:r>
-              <w:t xml:space="preserve"/>
-            </w:r>
-          </w:p>
+          <w:p/>
         </w:tc>
         <w:tc>
           <w:tcPr>
@@ -10775,11 +10496,7 @@
               <w:right w:type="dxa" w:w="120"/>
             </w:tcMar>
           </w:tcPr>
-          <w:p>
-            <w:r>
-              <w:t xml:space="preserve"/>
-            </w:r>
-          </w:p>
+          <w:p/>
         </w:tc>
         <w:tc>
           <w:tcPr>
@@ -10797,11 +10514,7 @@
               <w:right w:type="dxa" w:w="120"/>
             </w:tcMar>
           </w:tcPr>
-          <w:p>
-            <w:r>
-              <w:t xml:space="preserve"/>
-            </w:r>
-          </w:p>
+          <w:p/>
         </w:tc>
         <w:tc>
           <w:tcPr>
@@ -10819,11 +10532,7 @@
               <w:right w:type="dxa" w:w="120"/>
             </w:tcMar>
           </w:tcPr>
-          <w:p>
-            <w:r>
-              <w:t xml:space="preserve"/>
-            </w:r>
-          </w:p>
+          <w:p/>
         </w:tc>
         <w:tc>
           <w:tcPr>
@@ -10841,11 +10550,7 @@
               <w:right w:type="dxa" w:w="120"/>
             </w:tcMar>
           </w:tcPr>
-          <w:p>
-            <w:r>
-              <w:t xml:space="preserve"/>
-            </w:r>
-          </w:p>
+          <w:p/>
         </w:tc>
       </w:tr>
     </w:tbl>
@@ -12906,7 +12611,7 @@
                 <w:sz w:val="18"/>
                 <w:szCs w:val="18"/>
               </w:rPr>
-              <w:t xml:space="preserve">No framework setting: leave the trip-id scenarios out, or record a finding.</w:t>
+              <w:t xml:space="preserve">Test Config › 1 Test Framework › Sales Flows › Offer requests (search, specification, trip id). With search and specification both ticked, the catalogue offers each convertible scenario twice (the second ends in _SPEC). Each trip’s Trip Type must match.</w:t>
             </w:r>
           </w:p>
         </w:tc>
@@ -12933,7 +12638,7 @@
                 <w:sz w:val="18"/>
                 <w:szCs w:val="18"/>
               </w:rPr>
-              <w:t xml:space="preserve">Trip-id scenarios fail at step 01.</w:t>
+              <w:t xml:space="preserve">Every form: the catalogue copies its scenarios as they are.</w:t>
             </w:r>
           </w:p>
         </w:tc>

</xml_diff>

<commit_message>
feat(#748): the Test Framework declares the offer request forms; the catalogue follows them (#752)
Claude-Session: https://claude.ai/code/session_01A3xnyikQ6UQkr5ZjBscCyY

Co-Authored-By: Claude Opus 5.5 <noreply@anthropic.com>
</commit_message>
<xml_diff>
--- a/Documentation/User_Guides/OSCAR_Test_Config_Checklist.docx
+++ b/Documentation/User_Guides/OSCAR_Test_Config_Checklist.docx
@@ -183,11 +183,7 @@
               <w:right w:type="dxa" w:w="120"/>
             </w:tcMar>
           </w:tcPr>
-          <w:p>
-            <w:r>
-              <w:t xml:space="preserve"/>
-            </w:r>
-          </w:p>
+          <w:p/>
         </w:tc>
         <w:tc>
           <w:tcPr>
@@ -205,11 +201,7 @@
               <w:right w:type="dxa" w:w="120"/>
             </w:tcMar>
           </w:tcPr>
-          <w:p>
-            <w:r>
-              <w:t xml:space="preserve"/>
-            </w:r>
-          </w:p>
+          <w:p/>
         </w:tc>
         <w:tc>
           <w:tcPr>
@@ -227,11 +219,7 @@
               <w:right w:type="dxa" w:w="120"/>
             </w:tcMar>
           </w:tcPr>
-          <w:p>
-            <w:r>
-              <w:t xml:space="preserve"/>
-            </w:r>
-          </w:p>
+          <w:p/>
         </w:tc>
         <w:tc>
           <w:tcPr>
@@ -249,11 +237,7 @@
               <w:right w:type="dxa" w:w="120"/>
             </w:tcMar>
           </w:tcPr>
-          <w:p>
-            <w:r>
-              <w:t xml:space="preserve"/>
-            </w:r>
-          </w:p>
+          <w:p/>
         </w:tc>
       </w:tr>
     </w:tbl>
@@ -2231,7 +2215,7 @@
               <w:t xml:space="preserve">A4.2  </w:t>
             </w:r>
             <w:r>
-              <w:t xml:space="preserve">Can offers be requested by trip id, after </w:t>
+              <w:t xml:space="preserve">How can offers be requested: by trip search (</w:t>
             </w:r>
             <w:r>
               <w:rPr>
@@ -2239,10 +2223,43 @@
                 <w:sz w:val="19"/>
                 <w:szCs w:val="19"/>
               </w:rPr>
+              <w:t xml:space="preserve">tripSearchCriteria</w:t>
+            </w:r>
+            <w:r>
+              <w:t xml:space="preserve">), by trip specification (</w:t>
+            </w:r>
+            <w:r>
+              <w:rPr>
+                <w:rFonts w:ascii="Consolas" w:cs="Consolas" w:eastAsia="Consolas" w:hAnsi="Consolas"/>
+                <w:sz w:val="19"/>
+                <w:szCs w:val="19"/>
+              </w:rPr>
+              <w:t xml:space="preserve">tripSpecifications</w:t>
+            </w:r>
+            <w:r>
+              <w:t xml:space="preserve">, the exact train and its times), by trip id after </w:t>
+            </w:r>
+            <w:r>
+              <w:rPr>
+                <w:rFonts w:ascii="Consolas" w:cs="Consolas" w:eastAsia="Consolas" w:hAnsi="Consolas"/>
+                <w:sz w:val="19"/>
+                <w:szCs w:val="19"/>
+              </w:rPr>
               <w:t xml:space="preserve">POST /trips-collection</w:t>
             </w:r>
             <w:r>
-              <w:t xml:space="preserve">?</w:t>
+              <w:t xml:space="preserve"> (</w:t>
+            </w:r>
+            <w:r>
+              <w:rPr>
+                <w:rFonts w:ascii="Consolas" w:cs="Consolas" w:eastAsia="Consolas" w:hAnsi="Consolas"/>
+                <w:sz w:val="19"/>
+                <w:szCs w:val="19"/>
+              </w:rPr>
+              <w:t xml:space="preserve">tripIds</w:t>
+            </w:r>
+            <w:r>
+              <w:t xml:space="preserve">)? Which is preferred?</w:t>
             </w:r>
           </w:p>
         </w:tc>
@@ -4544,11 +4561,7 @@
               <w:right w:type="dxa" w:w="120"/>
             </w:tcMar>
           </w:tcPr>
-          <w:p>
-            <w:r>
-              <w:t xml:space="preserve"/>
-            </w:r>
-          </w:p>
+          <w:p/>
         </w:tc>
         <w:tc>
           <w:tcPr>
@@ -4566,11 +4579,7 @@
               <w:right w:type="dxa" w:w="120"/>
             </w:tcMar>
           </w:tcPr>
-          <w:p>
-            <w:r>
-              <w:t xml:space="preserve"/>
-            </w:r>
-          </w:p>
+          <w:p/>
         </w:tc>
         <w:tc>
           <w:tcPr>
@@ -4588,11 +4597,7 @@
               <w:right w:type="dxa" w:w="120"/>
             </w:tcMar>
           </w:tcPr>
-          <w:p>
-            <w:r>
-              <w:t xml:space="preserve"/>
-            </w:r>
-          </w:p>
+          <w:p/>
         </w:tc>
         <w:tc>
           <w:tcPr>
@@ -4610,11 +4615,7 @@
               <w:right w:type="dxa" w:w="120"/>
             </w:tcMar>
           </w:tcPr>
-          <w:p>
-            <w:r>
-              <w:t xml:space="preserve"/>
-            </w:r>
-          </w:p>
+          <w:p/>
         </w:tc>
         <w:tc>
           <w:tcPr>
@@ -4632,11 +4633,7 @@
               <w:right w:type="dxa" w:w="120"/>
             </w:tcMar>
           </w:tcPr>
-          <w:p>
-            <w:r>
-              <w:t xml:space="preserve"/>
-            </w:r>
-          </w:p>
+          <w:p/>
         </w:tc>
       </w:tr>
       <w:tr>
@@ -4659,11 +4656,7 @@
               <w:right w:type="dxa" w:w="120"/>
             </w:tcMar>
           </w:tcPr>
-          <w:p>
-            <w:r>
-              <w:t xml:space="preserve"/>
-            </w:r>
-          </w:p>
+          <w:p/>
         </w:tc>
         <w:tc>
           <w:tcPr>
@@ -4681,11 +4674,7 @@
               <w:right w:type="dxa" w:w="120"/>
             </w:tcMar>
           </w:tcPr>
-          <w:p>
-            <w:r>
-              <w:t xml:space="preserve"/>
-            </w:r>
-          </w:p>
+          <w:p/>
         </w:tc>
         <w:tc>
           <w:tcPr>
@@ -4703,11 +4692,7 @@
               <w:right w:type="dxa" w:w="120"/>
             </w:tcMar>
           </w:tcPr>
-          <w:p>
-            <w:r>
-              <w:t xml:space="preserve"/>
-            </w:r>
-          </w:p>
+          <w:p/>
         </w:tc>
         <w:tc>
           <w:tcPr>
@@ -4725,11 +4710,7 @@
               <w:right w:type="dxa" w:w="120"/>
             </w:tcMar>
           </w:tcPr>
-          <w:p>
-            <w:r>
-              <w:t xml:space="preserve"/>
-            </w:r>
-          </w:p>
+          <w:p/>
         </w:tc>
         <w:tc>
           <w:tcPr>
@@ -4747,11 +4728,7 @@
               <w:right w:type="dxa" w:w="120"/>
             </w:tcMar>
           </w:tcPr>
-          <w:p>
-            <w:r>
-              <w:t xml:space="preserve"/>
-            </w:r>
-          </w:p>
+          <w:p/>
         </w:tc>
       </w:tr>
       <w:tr>
@@ -4774,11 +4751,7 @@
               <w:right w:type="dxa" w:w="120"/>
             </w:tcMar>
           </w:tcPr>
-          <w:p>
-            <w:r>
-              <w:t xml:space="preserve"/>
-            </w:r>
-          </w:p>
+          <w:p/>
         </w:tc>
         <w:tc>
           <w:tcPr>
@@ -4796,11 +4769,7 @@
               <w:right w:type="dxa" w:w="120"/>
             </w:tcMar>
           </w:tcPr>
-          <w:p>
-            <w:r>
-              <w:t xml:space="preserve"/>
-            </w:r>
-          </w:p>
+          <w:p/>
         </w:tc>
         <w:tc>
           <w:tcPr>
@@ -4818,11 +4787,7 @@
               <w:right w:type="dxa" w:w="120"/>
             </w:tcMar>
           </w:tcPr>
-          <w:p>
-            <w:r>
-              <w:t xml:space="preserve"/>
-            </w:r>
-          </w:p>
+          <w:p/>
         </w:tc>
         <w:tc>
           <w:tcPr>
@@ -4840,11 +4805,7 @@
               <w:right w:type="dxa" w:w="120"/>
             </w:tcMar>
           </w:tcPr>
-          <w:p>
-            <w:r>
-              <w:t xml:space="preserve"/>
-            </w:r>
-          </w:p>
+          <w:p/>
         </w:tc>
         <w:tc>
           <w:tcPr>
@@ -4862,11 +4823,7 @@
               <w:right w:type="dxa" w:w="120"/>
             </w:tcMar>
           </w:tcPr>
-          <w:p>
-            <w:r>
-              <w:t xml:space="preserve"/>
-            </w:r>
-          </w:p>
+          <w:p/>
         </w:tc>
       </w:tr>
     </w:tbl>
@@ -6038,11 +5995,7 @@
               <w:right w:type="dxa" w:w="120"/>
             </w:tcMar>
           </w:tcPr>
-          <w:p>
-            <w:r>
-              <w:t xml:space="preserve"/>
-            </w:r>
-          </w:p>
+          <w:p/>
         </w:tc>
         <w:tc>
           <w:tcPr>
@@ -6060,11 +6013,7 @@
               <w:right w:type="dxa" w:w="120"/>
             </w:tcMar>
           </w:tcPr>
-          <w:p>
-            <w:r>
-              <w:t xml:space="preserve"/>
-            </w:r>
-          </w:p>
+          <w:p/>
         </w:tc>
         <w:tc>
           <w:tcPr>
@@ -6082,11 +6031,7 @@
               <w:right w:type="dxa" w:w="120"/>
             </w:tcMar>
           </w:tcPr>
-          <w:p>
-            <w:r>
-              <w:t xml:space="preserve"/>
-            </w:r>
-          </w:p>
+          <w:p/>
         </w:tc>
         <w:tc>
           <w:tcPr>
@@ -6104,11 +6049,7 @@
               <w:right w:type="dxa" w:w="120"/>
             </w:tcMar>
           </w:tcPr>
-          <w:p>
-            <w:r>
-              <w:t xml:space="preserve"/>
-            </w:r>
-          </w:p>
+          <w:p/>
         </w:tc>
         <w:tc>
           <w:tcPr>
@@ -6126,11 +6067,7 @@
               <w:right w:type="dxa" w:w="120"/>
             </w:tcMar>
           </w:tcPr>
-          <w:p>
-            <w:r>
-              <w:t xml:space="preserve"/>
-            </w:r>
-          </w:p>
+          <w:p/>
         </w:tc>
       </w:tr>
       <w:tr>
@@ -6153,11 +6090,7 @@
               <w:right w:type="dxa" w:w="120"/>
             </w:tcMar>
           </w:tcPr>
-          <w:p>
-            <w:r>
-              <w:t xml:space="preserve"/>
-            </w:r>
-          </w:p>
+          <w:p/>
         </w:tc>
         <w:tc>
           <w:tcPr>
@@ -6175,11 +6108,7 @@
               <w:right w:type="dxa" w:w="120"/>
             </w:tcMar>
           </w:tcPr>
-          <w:p>
-            <w:r>
-              <w:t xml:space="preserve"/>
-            </w:r>
-          </w:p>
+          <w:p/>
         </w:tc>
         <w:tc>
           <w:tcPr>
@@ -6197,11 +6126,7 @@
               <w:right w:type="dxa" w:w="120"/>
             </w:tcMar>
           </w:tcPr>
-          <w:p>
-            <w:r>
-              <w:t xml:space="preserve"/>
-            </w:r>
-          </w:p>
+          <w:p/>
         </w:tc>
         <w:tc>
           <w:tcPr>
@@ -6219,11 +6144,7 @@
               <w:right w:type="dxa" w:w="120"/>
             </w:tcMar>
           </w:tcPr>
-          <w:p>
-            <w:r>
-              <w:t xml:space="preserve"/>
-            </w:r>
-          </w:p>
+          <w:p/>
         </w:tc>
         <w:tc>
           <w:tcPr>
@@ -6241,11 +6162,7 @@
               <w:right w:type="dxa" w:w="120"/>
             </w:tcMar>
           </w:tcPr>
-          <w:p>
-            <w:r>
-              <w:t xml:space="preserve"/>
-            </w:r>
-          </w:p>
+          <w:p/>
         </w:tc>
       </w:tr>
       <w:tr>
@@ -6268,11 +6185,7 @@
               <w:right w:type="dxa" w:w="120"/>
             </w:tcMar>
           </w:tcPr>
-          <w:p>
-            <w:r>
-              <w:t xml:space="preserve"/>
-            </w:r>
-          </w:p>
+          <w:p/>
         </w:tc>
         <w:tc>
           <w:tcPr>
@@ -6290,11 +6203,7 @@
               <w:right w:type="dxa" w:w="120"/>
             </w:tcMar>
           </w:tcPr>
-          <w:p>
-            <w:r>
-              <w:t xml:space="preserve"/>
-            </w:r>
-          </w:p>
+          <w:p/>
         </w:tc>
         <w:tc>
           <w:tcPr>
@@ -6312,11 +6221,7 @@
               <w:right w:type="dxa" w:w="120"/>
             </w:tcMar>
           </w:tcPr>
-          <w:p>
-            <w:r>
-              <w:t xml:space="preserve"/>
-            </w:r>
-          </w:p>
+          <w:p/>
         </w:tc>
         <w:tc>
           <w:tcPr>
@@ -6334,11 +6239,7 @@
               <w:right w:type="dxa" w:w="120"/>
             </w:tcMar>
           </w:tcPr>
-          <w:p>
-            <w:r>
-              <w:t xml:space="preserve"/>
-            </w:r>
-          </w:p>
+          <w:p/>
         </w:tc>
         <w:tc>
           <w:tcPr>
@@ -6356,11 +6257,7 @@
               <w:right w:type="dxa" w:w="120"/>
             </w:tcMar>
           </w:tcPr>
-          <w:p>
-            <w:r>
-              <w:t xml:space="preserve"/>
-            </w:r>
-          </w:p>
+          <w:p/>
         </w:tc>
       </w:tr>
     </w:tbl>
@@ -7532,11 +7429,7 @@
               <w:right w:type="dxa" w:w="120"/>
             </w:tcMar>
           </w:tcPr>
-          <w:p>
-            <w:r>
-              <w:t xml:space="preserve"/>
-            </w:r>
-          </w:p>
+          <w:p/>
         </w:tc>
         <w:tc>
           <w:tcPr>
@@ -7554,11 +7447,7 @@
               <w:right w:type="dxa" w:w="120"/>
             </w:tcMar>
           </w:tcPr>
-          <w:p>
-            <w:r>
-              <w:t xml:space="preserve"/>
-            </w:r>
-          </w:p>
+          <w:p/>
         </w:tc>
         <w:tc>
           <w:tcPr>
@@ -7576,11 +7465,7 @@
               <w:right w:type="dxa" w:w="120"/>
             </w:tcMar>
           </w:tcPr>
-          <w:p>
-            <w:r>
-              <w:t xml:space="preserve"/>
-            </w:r>
-          </w:p>
+          <w:p/>
         </w:tc>
         <w:tc>
           <w:tcPr>
@@ -7598,11 +7483,7 @@
               <w:right w:type="dxa" w:w="120"/>
             </w:tcMar>
           </w:tcPr>
-          <w:p>
-            <w:r>
-              <w:t xml:space="preserve"/>
-            </w:r>
-          </w:p>
+          <w:p/>
         </w:tc>
         <w:tc>
           <w:tcPr>
@@ -7620,11 +7501,7 @@
               <w:right w:type="dxa" w:w="120"/>
             </w:tcMar>
           </w:tcPr>
-          <w:p>
-            <w:r>
-              <w:t xml:space="preserve"/>
-            </w:r>
-          </w:p>
+          <w:p/>
         </w:tc>
       </w:tr>
       <w:tr>
@@ -7647,11 +7524,7 @@
               <w:right w:type="dxa" w:w="120"/>
             </w:tcMar>
           </w:tcPr>
-          <w:p>
-            <w:r>
-              <w:t xml:space="preserve"/>
-            </w:r>
-          </w:p>
+          <w:p/>
         </w:tc>
         <w:tc>
           <w:tcPr>
@@ -7669,11 +7542,7 @@
               <w:right w:type="dxa" w:w="120"/>
             </w:tcMar>
           </w:tcPr>
-          <w:p>
-            <w:r>
-              <w:t xml:space="preserve"/>
-            </w:r>
-          </w:p>
+          <w:p/>
         </w:tc>
         <w:tc>
           <w:tcPr>
@@ -7691,11 +7560,7 @@
               <w:right w:type="dxa" w:w="120"/>
             </w:tcMar>
           </w:tcPr>
-          <w:p>
-            <w:r>
-              <w:t xml:space="preserve"/>
-            </w:r>
-          </w:p>
+          <w:p/>
         </w:tc>
         <w:tc>
           <w:tcPr>
@@ -7713,11 +7578,7 @@
               <w:right w:type="dxa" w:w="120"/>
             </w:tcMar>
           </w:tcPr>
-          <w:p>
-            <w:r>
-              <w:t xml:space="preserve"/>
-            </w:r>
-          </w:p>
+          <w:p/>
         </w:tc>
         <w:tc>
           <w:tcPr>
@@ -7735,11 +7596,7 @@
               <w:right w:type="dxa" w:w="120"/>
             </w:tcMar>
           </w:tcPr>
-          <w:p>
-            <w:r>
-              <w:t xml:space="preserve"/>
-            </w:r>
-          </w:p>
+          <w:p/>
         </w:tc>
       </w:tr>
       <w:tr>
@@ -7762,11 +7619,7 @@
               <w:right w:type="dxa" w:w="120"/>
             </w:tcMar>
           </w:tcPr>
-          <w:p>
-            <w:r>
-              <w:t xml:space="preserve"/>
-            </w:r>
-          </w:p>
+          <w:p/>
         </w:tc>
         <w:tc>
           <w:tcPr>
@@ -7784,11 +7637,7 @@
               <w:right w:type="dxa" w:w="120"/>
             </w:tcMar>
           </w:tcPr>
-          <w:p>
-            <w:r>
-              <w:t xml:space="preserve"/>
-            </w:r>
-          </w:p>
+          <w:p/>
         </w:tc>
         <w:tc>
           <w:tcPr>
@@ -7806,11 +7655,7 @@
               <w:right w:type="dxa" w:w="120"/>
             </w:tcMar>
           </w:tcPr>
-          <w:p>
-            <w:r>
-              <w:t xml:space="preserve"/>
-            </w:r>
-          </w:p>
+          <w:p/>
         </w:tc>
         <w:tc>
           <w:tcPr>
@@ -7828,11 +7673,7 @@
               <w:right w:type="dxa" w:w="120"/>
             </w:tcMar>
           </w:tcPr>
-          <w:p>
-            <w:r>
-              <w:t xml:space="preserve"/>
-            </w:r>
-          </w:p>
+          <w:p/>
         </w:tc>
         <w:tc>
           <w:tcPr>
@@ -7850,11 +7691,7 @@
               <w:right w:type="dxa" w:w="120"/>
             </w:tcMar>
           </w:tcPr>
-          <w:p>
-            <w:r>
-              <w:t xml:space="preserve"/>
-            </w:r>
-          </w:p>
+          <w:p/>
         </w:tc>
       </w:tr>
     </w:tbl>
@@ -9026,11 +8863,7 @@
               <w:right w:type="dxa" w:w="120"/>
             </w:tcMar>
           </w:tcPr>
-          <w:p>
-            <w:r>
-              <w:t xml:space="preserve"/>
-            </w:r>
-          </w:p>
+          <w:p/>
         </w:tc>
         <w:tc>
           <w:tcPr>
@@ -9048,11 +8881,7 @@
               <w:right w:type="dxa" w:w="120"/>
             </w:tcMar>
           </w:tcPr>
-          <w:p>
-            <w:r>
-              <w:t xml:space="preserve"/>
-            </w:r>
-          </w:p>
+          <w:p/>
         </w:tc>
         <w:tc>
           <w:tcPr>
@@ -9070,11 +8899,7 @@
               <w:right w:type="dxa" w:w="120"/>
             </w:tcMar>
           </w:tcPr>
-          <w:p>
-            <w:r>
-              <w:t xml:space="preserve"/>
-            </w:r>
-          </w:p>
+          <w:p/>
         </w:tc>
         <w:tc>
           <w:tcPr>
@@ -9092,11 +8917,7 @@
               <w:right w:type="dxa" w:w="120"/>
             </w:tcMar>
           </w:tcPr>
-          <w:p>
-            <w:r>
-              <w:t xml:space="preserve"/>
-            </w:r>
-          </w:p>
+          <w:p/>
         </w:tc>
         <w:tc>
           <w:tcPr>
@@ -9114,11 +8935,7 @@
               <w:right w:type="dxa" w:w="120"/>
             </w:tcMar>
           </w:tcPr>
-          <w:p>
-            <w:r>
-              <w:t xml:space="preserve"/>
-            </w:r>
-          </w:p>
+          <w:p/>
         </w:tc>
       </w:tr>
       <w:tr>
@@ -9141,11 +8958,7 @@
               <w:right w:type="dxa" w:w="120"/>
             </w:tcMar>
           </w:tcPr>
-          <w:p>
-            <w:r>
-              <w:t xml:space="preserve"/>
-            </w:r>
-          </w:p>
+          <w:p/>
         </w:tc>
         <w:tc>
           <w:tcPr>
@@ -9163,11 +8976,7 @@
               <w:right w:type="dxa" w:w="120"/>
             </w:tcMar>
           </w:tcPr>
-          <w:p>
-            <w:r>
-              <w:t xml:space="preserve"/>
-            </w:r>
-          </w:p>
+          <w:p/>
         </w:tc>
         <w:tc>
           <w:tcPr>
@@ -9185,11 +8994,7 @@
               <w:right w:type="dxa" w:w="120"/>
             </w:tcMar>
           </w:tcPr>
-          <w:p>
-            <w:r>
-              <w:t xml:space="preserve"/>
-            </w:r>
-          </w:p>
+          <w:p/>
         </w:tc>
         <w:tc>
           <w:tcPr>
@@ -9207,11 +9012,7 @@
               <w:right w:type="dxa" w:w="120"/>
             </w:tcMar>
           </w:tcPr>
-          <w:p>
-            <w:r>
-              <w:t xml:space="preserve"/>
-            </w:r>
-          </w:p>
+          <w:p/>
         </w:tc>
         <w:tc>
           <w:tcPr>
@@ -9229,11 +9030,7 @@
               <w:right w:type="dxa" w:w="120"/>
             </w:tcMar>
           </w:tcPr>
-          <w:p>
-            <w:r>
-              <w:t xml:space="preserve"/>
-            </w:r>
-          </w:p>
+          <w:p/>
         </w:tc>
       </w:tr>
       <w:tr>
@@ -9256,11 +9053,7 @@
               <w:right w:type="dxa" w:w="120"/>
             </w:tcMar>
           </w:tcPr>
-          <w:p>
-            <w:r>
-              <w:t xml:space="preserve"/>
-            </w:r>
-          </w:p>
+          <w:p/>
         </w:tc>
         <w:tc>
           <w:tcPr>
@@ -9278,11 +9071,7 @@
               <w:right w:type="dxa" w:w="120"/>
             </w:tcMar>
           </w:tcPr>
-          <w:p>
-            <w:r>
-              <w:t xml:space="preserve"/>
-            </w:r>
-          </w:p>
+          <w:p/>
         </w:tc>
         <w:tc>
           <w:tcPr>
@@ -9300,11 +9089,7 @@
               <w:right w:type="dxa" w:w="120"/>
             </w:tcMar>
           </w:tcPr>
-          <w:p>
-            <w:r>
-              <w:t xml:space="preserve"/>
-            </w:r>
-          </w:p>
+          <w:p/>
         </w:tc>
         <w:tc>
           <w:tcPr>
@@ -9322,11 +9107,7 @@
               <w:right w:type="dxa" w:w="120"/>
             </w:tcMar>
           </w:tcPr>
-          <w:p>
-            <w:r>
-              <w:t xml:space="preserve"/>
-            </w:r>
-          </w:p>
+          <w:p/>
         </w:tc>
         <w:tc>
           <w:tcPr>
@@ -9344,11 +9125,7 @@
               <w:right w:type="dxa" w:w="120"/>
             </w:tcMar>
           </w:tcPr>
-          <w:p>
-            <w:r>
-              <w:t xml:space="preserve"/>
-            </w:r>
-          </w:p>
+          <w:p/>
         </w:tc>
       </w:tr>
     </w:tbl>
@@ -10457,11 +10234,7 @@
               <w:right w:type="dxa" w:w="120"/>
             </w:tcMar>
           </w:tcPr>
-          <w:p>
-            <w:r>
-              <w:t xml:space="preserve"/>
-            </w:r>
-          </w:p>
+          <w:p/>
         </w:tc>
         <w:tc>
           <w:tcPr>
@@ -10479,11 +10252,7 @@
               <w:right w:type="dxa" w:w="120"/>
             </w:tcMar>
           </w:tcPr>
-          <w:p>
-            <w:r>
-              <w:t xml:space="preserve"/>
-            </w:r>
-          </w:p>
+          <w:p/>
         </w:tc>
         <w:tc>
           <w:tcPr>
@@ -10501,11 +10270,7 @@
               <w:right w:type="dxa" w:w="120"/>
             </w:tcMar>
           </w:tcPr>
-          <w:p>
-            <w:r>
-              <w:t xml:space="preserve"/>
-            </w:r>
-          </w:p>
+          <w:p/>
         </w:tc>
         <w:tc>
           <w:tcPr>
@@ -10523,11 +10288,7 @@
               <w:right w:type="dxa" w:w="120"/>
             </w:tcMar>
           </w:tcPr>
-          <w:p>
-            <w:r>
-              <w:t xml:space="preserve"/>
-            </w:r>
-          </w:p>
+          <w:p/>
         </w:tc>
         <w:tc>
           <w:tcPr>
@@ -10545,11 +10306,7 @@
               <w:right w:type="dxa" w:w="120"/>
             </w:tcMar>
           </w:tcPr>
-          <w:p>
-            <w:r>
-              <w:t xml:space="preserve"/>
-            </w:r>
-          </w:p>
+          <w:p/>
         </w:tc>
         <w:tc>
           <w:tcPr>
@@ -10567,11 +10324,7 @@
               <w:right w:type="dxa" w:w="120"/>
             </w:tcMar>
           </w:tcPr>
-          <w:p>
-            <w:r>
-              <w:t xml:space="preserve"/>
-            </w:r>
-          </w:p>
+          <w:p/>
         </w:tc>
       </w:tr>
       <w:tr>
@@ -10594,11 +10347,7 @@
               <w:right w:type="dxa" w:w="120"/>
             </w:tcMar>
           </w:tcPr>
-          <w:p>
-            <w:r>
-              <w:t xml:space="preserve"/>
-            </w:r>
-          </w:p>
+          <w:p/>
         </w:tc>
         <w:tc>
           <w:tcPr>
@@ -10616,11 +10365,7 @@
               <w:right w:type="dxa" w:w="120"/>
             </w:tcMar>
           </w:tcPr>
-          <w:p>
-            <w:r>
-              <w:t xml:space="preserve"/>
-            </w:r>
-          </w:p>
+          <w:p/>
         </w:tc>
         <w:tc>
           <w:tcPr>
@@ -10638,11 +10383,7 @@
               <w:right w:type="dxa" w:w="120"/>
             </w:tcMar>
           </w:tcPr>
-          <w:p>
-            <w:r>
-              <w:t xml:space="preserve"/>
-            </w:r>
-          </w:p>
+          <w:p/>
         </w:tc>
         <w:tc>
           <w:tcPr>
@@ -10660,11 +10401,7 @@
               <w:right w:type="dxa" w:w="120"/>
             </w:tcMar>
           </w:tcPr>
-          <w:p>
-            <w:r>
-              <w:t xml:space="preserve"/>
-            </w:r>
-          </w:p>
+          <w:p/>
         </w:tc>
         <w:tc>
           <w:tcPr>
@@ -10682,11 +10419,7 @@
               <w:right w:type="dxa" w:w="120"/>
             </w:tcMar>
           </w:tcPr>
-          <w:p>
-            <w:r>
-              <w:t xml:space="preserve"/>
-            </w:r>
-          </w:p>
+          <w:p/>
         </w:tc>
         <w:tc>
           <w:tcPr>
@@ -10704,11 +10437,7 @@
               <w:right w:type="dxa" w:w="120"/>
             </w:tcMar>
           </w:tcPr>
-          <w:p>
-            <w:r>
-              <w:t xml:space="preserve"/>
-            </w:r>
-          </w:p>
+          <w:p/>
         </w:tc>
       </w:tr>
       <w:tr>
@@ -10731,11 +10460,7 @@
               <w:right w:type="dxa" w:w="120"/>
             </w:tcMar>
           </w:tcPr>
-          <w:p>
-            <w:r>
-              <w:t xml:space="preserve"/>
-            </w:r>
-          </w:p>
+          <w:p/>
         </w:tc>
         <w:tc>
           <w:tcPr>
@@ -10753,11 +10478,7 @@
               <w:right w:type="dxa" w:w="120"/>
             </w:tcMar>
           </w:tcPr>
-          <w:p>
-            <w:r>
-              <w:t xml:space="preserve"/>
-            </w:r>
-          </w:p>
+          <w:p/>
         </w:tc>
         <w:tc>
           <w:tcPr>
@@ -10775,11 +10496,7 @@
               <w:right w:type="dxa" w:w="120"/>
             </w:tcMar>
           </w:tcPr>
-          <w:p>
-            <w:r>
-              <w:t xml:space="preserve"/>
-            </w:r>
-          </w:p>
+          <w:p/>
         </w:tc>
         <w:tc>
           <w:tcPr>
@@ -10797,11 +10514,7 @@
               <w:right w:type="dxa" w:w="120"/>
             </w:tcMar>
           </w:tcPr>
-          <w:p>
-            <w:r>
-              <w:t xml:space="preserve"/>
-            </w:r>
-          </w:p>
+          <w:p/>
         </w:tc>
         <w:tc>
           <w:tcPr>
@@ -10819,11 +10532,7 @@
               <w:right w:type="dxa" w:w="120"/>
             </w:tcMar>
           </w:tcPr>
-          <w:p>
-            <w:r>
-              <w:t xml:space="preserve"/>
-            </w:r>
-          </w:p>
+          <w:p/>
         </w:tc>
         <w:tc>
           <w:tcPr>
@@ -10841,11 +10550,7 @@
               <w:right w:type="dxa" w:w="120"/>
             </w:tcMar>
           </w:tcPr>
-          <w:p>
-            <w:r>
-              <w:t xml:space="preserve"/>
-            </w:r>
-          </w:p>
+          <w:p/>
         </w:tc>
       </w:tr>
     </w:tbl>
@@ -12906,7 +12611,7 @@
                 <w:sz w:val="18"/>
                 <w:szCs w:val="18"/>
               </w:rPr>
-              <w:t xml:space="preserve">No framework setting: leave the trip-id scenarios out, or record a finding.</w:t>
+              <w:t xml:space="preserve">Test Config › 1 Test Framework › Sales Flows › Offer requests (search, specification, trip id). With search and specification both ticked, the catalogue offers each convertible scenario twice (the second ends in _SPEC). Each trip’s Trip Type must match.</w:t>
             </w:r>
           </w:p>
         </w:tc>
@@ -12933,7 +12638,7 @@
                 <w:sz w:val="18"/>
                 <w:szCs w:val="18"/>
               </w:rPr>
-              <w:t xml:space="preserve">Trip-id scenarios fail at step 01.</w:t>
+              <w:t xml:space="preserve">Every form: the catalogue copies its scenarios as they are.</w:t>
             </w:r>
           </w:p>
         </w:tc>

</xml_diff>